<commit_message>
little bit of play
</commit_message>
<xml_diff>
--- a/manuscript/Empirical HCR snow crab.docx
+++ b/manuscript/Empirical HCR snow crab.docx
@@ -16,7 +16,15 @@
     </w:p>
     <w:p>
       <w:r>
-        <w:t>Survey selectivity, Fishery selectivity,  Terminal molt, Variable mortality</w:t>
+        <w:t xml:space="preserve">Survey selectivity, Fishery </w:t>
+      </w:r>
+      <w:proofErr w:type="gramStart"/>
+      <w:r>
+        <w:t>selectivity,  Terminal</w:t>
+      </w:r>
+      <w:proofErr w:type="gramEnd"/>
+      <w:r>
+        <w:t xml:space="preserve"> molt, Variable mortality</w:t>
       </w:r>
     </w:p>
     <w:p>
@@ -24,21 +32,30 @@
         <w:t>Collapse + no recovery</w:t>
       </w:r>
     </w:p>
+    <w:p>
+      <w:r>
+        <w:t>The model is complicated and uncertainties in the model make it hard to see the forest for the trees.</w:t>
+      </w:r>
+    </w:p>
+    <w:p>
+      <w:r>
+        <w:t>Stock assessment issues (modeling and reference points)</w:t>
+      </w:r>
+    </w:p>
+    <w:p>
+      <w:r>
+        <w:t>Canadian comparison</w:t>
+      </w:r>
+    </w:p>
+    <w:p>
+      <w:r>
+        <w:t>GOAL OF ANALYSIS:</w:t>
+      </w:r>
+    </w:p>
     <w:p/>
     <w:p>
       <w:r>
-        <w:t>Stock assessment issues (modeling and reference points)</w:t>
-      </w:r>
-    </w:p>
-    <w:p>
-      <w:r>
-        <w:t>Canadian comparison</w:t>
-      </w:r>
-    </w:p>
-    <w:p/>
-    <w:p>
-      <w:r>
-        <w:t>Methods</w:t>
+        <w:t>METHODS</w:t>
       </w:r>
     </w:p>
     <w:p>
@@ -99,7 +116,11 @@
         <w:t>Show uncertainty for all</w:t>
       </w:r>
     </w:p>
-    <w:p/>
+    <w:p>
+      <w:r>
+        <w:t>Use temp in the model fitting or use GAM outside?</w:t>
+      </w:r>
+    </w:p>
     <w:p>
       <w:r>
         <w:t>Calculate total removals to achieve trajectory</w:t>
@@ -115,21 +136,131 @@
         <w:t>Where do you want to go? Do you want to get there fast or slow?</w:t>
       </w:r>
     </w:p>
-    <w:p/>
-    <w:p>
-      <w:r>
-        <w:t>Figure 1. Map, numbers at size.</w:t>
-      </w:r>
-    </w:p>
-    <w:p>
-      <w:r>
-        <w:t>Figure 2. Catch + value</w:t>
+    <w:p>
+      <w:r>
+        <w:t>Setting targets:</w:t>
+      </w:r>
+    </w:p>
+    <w:p>
+      <w:r>
+        <w:t xml:space="preserve">Show the analysis of how many </w:t>
+      </w:r>
+      <w:proofErr w:type="gramStart"/>
+      <w:r>
+        <w:t>crab</w:t>
+      </w:r>
+      <w:proofErr w:type="gramEnd"/>
+      <w:r>
+        <w:t xml:space="preserve"> make it to terminal molt at commercial size for different probabilities of terminally molting.</w:t>
+      </w:r>
+    </w:p>
+    <w:p>
+      <w:r>
+        <w:t>Figure 1. Map</w:t>
+      </w:r>
+      <w:r>
+        <w:t xml:space="preserve"> (survey footprint, large male density, fishery footprint)</w:t>
+      </w:r>
+      <w:r>
+        <w:t>, numbers at size.</w:t>
+      </w:r>
+    </w:p>
+    <w:p>
+      <w:r>
+        <w:lastRenderedPageBreak/>
+        <w:t xml:space="preserve">Figure 2. </w:t>
+      </w:r>
+      <w:r>
+        <w:t>Large male biomass, c</w:t>
+      </w:r>
+      <w:r>
+        <w:t>atch</w:t>
+      </w:r>
+      <w:r>
+        <w:t>, implied exploitation rate,</w:t>
+      </w:r>
+      <w:r>
+        <w:t xml:space="preserve"> value</w:t>
+      </w:r>
+      <w:r>
+        <w:t xml:space="preserve">. Plot the number of large </w:t>
+      </w:r>
+      <w:proofErr w:type="gramStart"/>
+      <w:r>
+        <w:t>crab</w:t>
+      </w:r>
+      <w:proofErr w:type="gramEnd"/>
+      <w:r>
+        <w:t xml:space="preserve"> the estimates are derived from?</w:t>
       </w:r>
     </w:p>
     <w:p>
       <w:r>
         <w:t>Figure 3. Diagram of HCR</w:t>
       </w:r>
+      <w:r>
+        <w:t>?</w:t>
+      </w:r>
+    </w:p>
+    <w:p>
+      <w:pPr>
+        <w:pStyle w:val="ListParagraph"/>
+        <w:numPr>
+          <w:ilvl w:val="0"/>
+          <w:numId w:val="2"/>
+        </w:numPr>
+      </w:pPr>
+      <w:r>
+        <w:t>Input range of sizes</w:t>
+      </w:r>
+    </w:p>
+    <w:p>
+      <w:pPr>
+        <w:pStyle w:val="ListParagraph"/>
+        <w:numPr>
+          <w:ilvl w:val="0"/>
+          <w:numId w:val="2"/>
+        </w:numPr>
+      </w:pPr>
+      <w:r>
+        <w:t>Predict next year based on size transition and an estimated survival</w:t>
+      </w:r>
+    </w:p>
+    <w:p>
+      <w:pPr>
+        <w:pStyle w:val="ListParagraph"/>
+        <w:numPr>
+          <w:ilvl w:val="0"/>
+          <w:numId w:val="2"/>
+        </w:numPr>
+      </w:pPr>
+      <w:r>
+        <w:t>Assume survey selectivity is close to one over this range (but the estimation of survival somewhat addresses this)</w:t>
+      </w:r>
+    </w:p>
+    <w:p>
+      <w:pPr>
+        <w:pStyle w:val="ListParagraph"/>
+        <w:numPr>
+          <w:ilvl w:val="0"/>
+          <w:numId w:val="2"/>
+        </w:numPr>
+      </w:pPr>
+      <w:r>
+        <w:t>Look at a range of harvests (what is replacement? What is no-fishing?)</w:t>
+      </w:r>
+    </w:p>
+    <w:p>
+      <w:pPr>
+        <w:pStyle w:val="ListParagraph"/>
+        <w:numPr>
+          <w:ilvl w:val="0"/>
+          <w:numId w:val="2"/>
+        </w:numPr>
+      </w:pPr>
+      <w:r>
+        <w:t>Choose harvest based on target and how fast you want to get there</w:t>
+      </w:r>
     </w:p>
     <w:p>
       <w:r>
@@ -138,7 +269,6 @@
     </w:p>
     <w:p>
       <w:r>
-        <w:lastRenderedPageBreak/>
         <w:t>Figure 5. GAMs for environment + density survival</w:t>
       </w:r>
     </w:p>
@@ -148,6 +278,9 @@
       </w:r>
       <w:r>
         <w:t xml:space="preserve"> Maturity issues and how they could inform target biomass</w:t>
+      </w:r>
+      <w:r>
+        <w:t xml:space="preserve">. Plot the maturity ogives, the % making it to terminal size given </w:t>
       </w:r>
     </w:p>
     <w:sectPr>
@@ -275,8 +408,124 @@
       </w:rPr>
     </w:lvl>
   </w:abstractNum>
+  <w:abstractNum w:abstractNumId="1" w15:restartNumberingAfterBreak="0">
+    <w:nsid w:val="5B3F38B5"/>
+    <w:multiLevelType w:val="hybridMultilevel"/>
+    <w:tmpl w:val="5D1458DE"/>
+    <w:lvl w:ilvl="0" w:tplc="04090001">
+      <w:start w:val="1"/>
+      <w:numFmt w:val="bullet"/>
+      <w:lvlText w:val=""/>
+      <w:lvlJc w:val="left"/>
+      <w:pPr>
+        <w:ind w:left="1485" w:hanging="360"/>
+      </w:pPr>
+      <w:rPr>
+        <w:rFonts w:ascii="Symbol" w:hAnsi="Symbol" w:hint="default"/>
+      </w:rPr>
+    </w:lvl>
+    <w:lvl w:ilvl="1" w:tplc="04090003" w:tentative="1">
+      <w:start w:val="1"/>
+      <w:numFmt w:val="bullet"/>
+      <w:lvlText w:val="o"/>
+      <w:lvlJc w:val="left"/>
+      <w:pPr>
+        <w:ind w:left="2205" w:hanging="360"/>
+      </w:pPr>
+      <w:rPr>
+        <w:rFonts w:ascii="Courier New" w:hAnsi="Courier New" w:cs="Courier New" w:hint="default"/>
+      </w:rPr>
+    </w:lvl>
+    <w:lvl w:ilvl="2" w:tplc="04090005" w:tentative="1">
+      <w:start w:val="1"/>
+      <w:numFmt w:val="bullet"/>
+      <w:lvlText w:val=""/>
+      <w:lvlJc w:val="left"/>
+      <w:pPr>
+        <w:ind w:left="2925" w:hanging="360"/>
+      </w:pPr>
+      <w:rPr>
+        <w:rFonts w:ascii="Wingdings" w:hAnsi="Wingdings" w:hint="default"/>
+      </w:rPr>
+    </w:lvl>
+    <w:lvl w:ilvl="3" w:tplc="04090001" w:tentative="1">
+      <w:start w:val="1"/>
+      <w:numFmt w:val="bullet"/>
+      <w:lvlText w:val=""/>
+      <w:lvlJc w:val="left"/>
+      <w:pPr>
+        <w:ind w:left="3645" w:hanging="360"/>
+      </w:pPr>
+      <w:rPr>
+        <w:rFonts w:ascii="Symbol" w:hAnsi="Symbol" w:hint="default"/>
+      </w:rPr>
+    </w:lvl>
+    <w:lvl w:ilvl="4" w:tplc="04090003" w:tentative="1">
+      <w:start w:val="1"/>
+      <w:numFmt w:val="bullet"/>
+      <w:lvlText w:val="o"/>
+      <w:lvlJc w:val="left"/>
+      <w:pPr>
+        <w:ind w:left="4365" w:hanging="360"/>
+      </w:pPr>
+      <w:rPr>
+        <w:rFonts w:ascii="Courier New" w:hAnsi="Courier New" w:cs="Courier New" w:hint="default"/>
+      </w:rPr>
+    </w:lvl>
+    <w:lvl w:ilvl="5" w:tplc="04090005" w:tentative="1">
+      <w:start w:val="1"/>
+      <w:numFmt w:val="bullet"/>
+      <w:lvlText w:val=""/>
+      <w:lvlJc w:val="left"/>
+      <w:pPr>
+        <w:ind w:left="5085" w:hanging="360"/>
+      </w:pPr>
+      <w:rPr>
+        <w:rFonts w:ascii="Wingdings" w:hAnsi="Wingdings" w:hint="default"/>
+      </w:rPr>
+    </w:lvl>
+    <w:lvl w:ilvl="6" w:tplc="04090001" w:tentative="1">
+      <w:start w:val="1"/>
+      <w:numFmt w:val="bullet"/>
+      <w:lvlText w:val=""/>
+      <w:lvlJc w:val="left"/>
+      <w:pPr>
+        <w:ind w:left="5805" w:hanging="360"/>
+      </w:pPr>
+      <w:rPr>
+        <w:rFonts w:ascii="Symbol" w:hAnsi="Symbol" w:hint="default"/>
+      </w:rPr>
+    </w:lvl>
+    <w:lvl w:ilvl="7" w:tplc="04090003" w:tentative="1">
+      <w:start w:val="1"/>
+      <w:numFmt w:val="bullet"/>
+      <w:lvlText w:val="o"/>
+      <w:lvlJc w:val="left"/>
+      <w:pPr>
+        <w:ind w:left="6525" w:hanging="360"/>
+      </w:pPr>
+      <w:rPr>
+        <w:rFonts w:ascii="Courier New" w:hAnsi="Courier New" w:cs="Courier New" w:hint="default"/>
+      </w:rPr>
+    </w:lvl>
+    <w:lvl w:ilvl="8" w:tplc="04090005" w:tentative="1">
+      <w:start w:val="1"/>
+      <w:numFmt w:val="bullet"/>
+      <w:lvlText w:val=""/>
+      <w:lvlJc w:val="left"/>
+      <w:pPr>
+        <w:ind w:left="7245" w:hanging="360"/>
+      </w:pPr>
+      <w:rPr>
+        <w:rFonts w:ascii="Wingdings" w:hAnsi="Wingdings" w:hint="default"/>
+      </w:rPr>
+    </w:lvl>
+  </w:abstractNum>
   <w:num w:numId="1" w16cid:durableId="1132602157">
     <w:abstractNumId w:val="0"/>
+  </w:num>
+  <w:num w:numId="2" w16cid:durableId="100730061">
+    <w:abstractNumId w:val="1"/>
   </w:num>
 </w:numbering>
 </file>

</xml_diff>